<commit_message>
Ajout final Dataviz, et Rapport ML corrigé fautes
</commit_message>
<xml_diff>
--- a/Rapport_ML_NAHA.docx
+++ b/Rapport_ML_NAHA.docx
@@ -161,12 +161,6 @@
         <w:gridCol w:w="4812"/>
       </w:tblGrid>
       <w:tr>
-        <w:tblPrEx>
-          <w:tblCellMar>
-            <w:top w:w="0" w:type="dxa"/>
-            <w:bottom w:w="0" w:type="dxa"/>
-          </w:tblCellMar>
-        </w:tblPrEx>
         <w:tc>
           <w:tcPr>
             <w:tcW w:w="0" w:type="auto"/>
@@ -730,7 +724,33 @@
           <w:sz w:val="24"/>
           <w:szCs w:val="24"/>
         </w:rPr>
-        <w:t>Deux critères complémentaires, alignés sur les recommandations OMS, ont été appliqués :</w:t>
+        <w:t>Deux critères complémentaires, alignés sur les recommandations OMS, ont été appliqués</w:t>
+      </w:r>
+      <w:r>
+        <w:rPr>
+          <w:rFonts w:ascii="Arial" w:hAnsi="Arial" w:cs="Arial"/>
+          <w:sz w:val="24"/>
+          <w:szCs w:val="24"/>
+        </w:rPr>
+        <w:t>. Il suffit de valider l’un des deux po</w:t>
+      </w:r>
+      <w:bookmarkStart w:id="0" w:name="_GoBack"/>
+      <w:bookmarkEnd w:id="0"/>
+      <w:r>
+        <w:rPr>
+          <w:rFonts w:ascii="Arial" w:hAnsi="Arial" w:cs="Arial"/>
+          <w:sz w:val="24"/>
+          <w:szCs w:val="24"/>
+        </w:rPr>
+        <w:t>ur être qualifié d’actifs</w:t>
+      </w:r>
+      <w:r>
+        <w:rPr>
+          <w:rFonts w:ascii="Arial" w:hAnsi="Arial" w:cs="Arial"/>
+          <w:sz w:val="24"/>
+          <w:szCs w:val="24"/>
+        </w:rPr>
+        <w:t> :</w:t>
       </w:r>
     </w:p>
     <w:p>
@@ -1213,23 +1233,7 @@
           <w:sz w:val="24"/>
           <w:szCs w:val="24"/>
         </w:rPr>
-        <w:t xml:space="preserve"> C’est pourquoi nous décidons que la base Sommeil soit </w:t>
-      </w:r>
-      <w:r>
-        <w:rPr>
-          <w:rFonts w:ascii="Arial" w:hAnsi="Arial" w:cs="Arial"/>
-          <w:sz w:val="24"/>
-          <w:szCs w:val="24"/>
-        </w:rPr>
-        <w:t>abandonnée pour la modélisation finale, au profit de la base Activité, dont les données, bien que plus imparfaites et désordonnées, représentent un défi scientifique plus pertinent e</w:t>
-      </w:r>
-      <w:r>
-        <w:rPr>
-          <w:rFonts w:ascii="Arial" w:hAnsi="Arial" w:cs="Arial"/>
-          <w:sz w:val="24"/>
-          <w:szCs w:val="24"/>
-        </w:rPr>
-        <w:t>t reflètent mieux la réalité.</w:t>
+        <w:t xml:space="preserve"> C’est pourquoi nous décidons que la base Sommeil soit abandonnée pour la modélisation finale, au profit de la base Activité, dont les données, bien que plus imparfaites et désordonnées, représentent un défi scientifique plus pertinent et reflètent mieux la réalité.</w:t>
       </w:r>
     </w:p>
     <w:p>
@@ -1825,25 +1829,7 @@
           <w:sz w:val="24"/>
           <w:szCs w:val="24"/>
         </w:rPr>
-        <w:t xml:space="preserve">Ce ratio 80/20 est le standard pour valider la fiabilité de l'IA. On utilise 80% des données pour l'apprentissage et </w:t>
-      </w:r>
-      <w:r>
-        <w:rPr>
-          <w:rFonts w:ascii="Arial" w:hAnsi="Arial" w:cs="Arial"/>
-          <w:b w:val="0"/>
-          <w:sz w:val="24"/>
-          <w:szCs w:val="24"/>
-        </w:rPr>
-        <w:t>on garde 20% pour le test final, c</w:t>
-      </w:r>
-      <w:r>
-        <w:rPr>
-          <w:rFonts w:ascii="Arial" w:hAnsi="Arial" w:cs="Arial"/>
-          <w:b w:val="0"/>
-          <w:sz w:val="24"/>
-          <w:szCs w:val="24"/>
-        </w:rPr>
-        <w:t>ela permet de vérifier si le modèle sait généraliser ou s'il a juste appris par cœur. C'est indispensable pour simuler l'arrivée d'un nouvel utilisateur sur le site et mesurer l'erreur réelle.</w:t>
+        <w:t>Ce ratio 80/20 est le standard pour valider la fiabilité de l'IA. On utilise 80% des données pour l'apprentissage et on garde 20% pour le test final, cela permet de vérifier si le modèle sait généraliser ou s'il a juste appris par cœur. C'est indispensable pour simuler l'arrivée d'un nouvel utilisateur sur le site et mesurer l'erreur réelle.</w:t>
       </w:r>
     </w:p>
     <w:p>
@@ -1907,12 +1893,6 @@
         <w:gridCol w:w="1905"/>
       </w:tblGrid>
       <w:tr>
-        <w:tblPrEx>
-          <w:tblCellMar>
-            <w:top w:w="0" w:type="dxa"/>
-            <w:bottom w:w="0" w:type="dxa"/>
-          </w:tblCellMar>
-        </w:tblPrEx>
         <w:tc>
           <w:tcPr>
             <w:tcW w:w="0" w:type="auto"/>
@@ -2105,12 +2085,6 @@
         </w:tc>
       </w:tr>
       <w:tr>
-        <w:tblPrEx>
-          <w:tblCellMar>
-            <w:top w:w="0" w:type="dxa"/>
-            <w:bottom w:w="0" w:type="dxa"/>
-          </w:tblCellMar>
-        </w:tblPrEx>
         <w:tc>
           <w:tcPr>
             <w:tcW w:w="0" w:type="auto"/>
@@ -2295,12 +2269,6 @@
         </w:tc>
       </w:tr>
       <w:tr>
-        <w:tblPrEx>
-          <w:tblCellMar>
-            <w:top w:w="0" w:type="dxa"/>
-            <w:bottom w:w="0" w:type="dxa"/>
-          </w:tblCellMar>
-        </w:tblPrEx>
         <w:tc>
           <w:tcPr>
             <w:tcW w:w="0" w:type="auto"/>
@@ -2485,12 +2453,6 @@
         </w:tc>
       </w:tr>
       <w:tr>
-        <w:tblPrEx>
-          <w:tblCellMar>
-            <w:top w:w="0" w:type="dxa"/>
-            <w:bottom w:w="0" w:type="dxa"/>
-          </w:tblCellMar>
-        </w:tblPrEx>
         <w:tc>
           <w:tcPr>
             <w:tcW w:w="0" w:type="auto"/>
@@ -2685,12 +2647,6 @@
         </w:tc>
       </w:tr>
       <w:tr>
-        <w:tblPrEx>
-          <w:tblCellMar>
-            <w:top w:w="0" w:type="dxa"/>
-            <w:bottom w:w="0" w:type="dxa"/>
-          </w:tblCellMar>
-        </w:tblPrEx>
         <w:tc>
           <w:tcPr>
             <w:tcW w:w="0" w:type="auto"/>
@@ -2877,12 +2833,6 @@
         </w:tc>
       </w:tr>
       <w:tr>
-        <w:tblPrEx>
-          <w:tblCellMar>
-            <w:top w:w="0" w:type="dxa"/>
-            <w:bottom w:w="0" w:type="dxa"/>
-          </w:tblCellMar>
-        </w:tblPrEx>
         <w:tc>
           <w:tcPr>
             <w:tcW w:w="0" w:type="auto"/>
@@ -3600,15 +3550,7 @@
           <w:sz w:val="24"/>
           <w:szCs w:val="24"/>
         </w:rPr>
-        <w:t>L</w:t>
-      </w:r>
-      <w:r>
-        <w:rPr>
-          <w:rFonts w:ascii="Arial" w:hAnsi="Arial" w:cs="Arial"/>
-          <w:sz w:val="24"/>
-          <w:szCs w:val="24"/>
-        </w:rPr>
-        <w:t xml:space="preserve">e choix du </w:t>
+        <w:t xml:space="preserve">Le choix du </w:t>
       </w:r>
       <w:r>
         <w:rPr>
@@ -3871,23 +3813,7 @@
           <w:sz w:val="24"/>
           <w:szCs w:val="24"/>
         </w:rPr>
-        <w:t xml:space="preserve"> Nous l’avons aussi choisi car elle nous permettait d’avoir le meilleur score de </w:t>
-      </w:r>
-      <w:r>
-        <w:rPr>
-          <w:rFonts w:ascii="Arial" w:hAnsi="Arial" w:cs="Arial"/>
-          <w:sz w:val="24"/>
-          <w:szCs w:val="24"/>
-        </w:rPr>
-        <w:t>R²</w:t>
-      </w:r>
-      <w:r>
-        <w:rPr>
-          <w:rFonts w:ascii="Arial" w:hAnsi="Arial" w:cs="Arial"/>
-          <w:sz w:val="24"/>
-          <w:szCs w:val="24"/>
-        </w:rPr>
-        <w:t>.</w:t>
+        <w:t xml:space="preserve"> Nous l’avons aussi choisi car elle nous permettait d’avoir le meilleur score de R².</w:t>
       </w:r>
     </w:p>
     <w:p>
@@ -4265,12 +4191,6 @@
         <w:gridCol w:w="1019"/>
       </w:tblGrid>
       <w:tr>
-        <w:tblPrEx>
-          <w:tblCellMar>
-            <w:top w:w="0" w:type="dxa"/>
-            <w:bottom w:w="0" w:type="dxa"/>
-          </w:tblCellMar>
-        </w:tblPrEx>
         <w:tc>
           <w:tcPr>
             <w:tcW w:w="0" w:type="auto"/>
@@ -4502,12 +4422,6 @@
         </w:tc>
       </w:tr>
       <w:tr>
-        <w:tblPrEx>
-          <w:tblCellMar>
-            <w:top w:w="0" w:type="dxa"/>
-            <w:bottom w:w="0" w:type="dxa"/>
-          </w:tblCellMar>
-        </w:tblPrEx>
         <w:trPr>
           <w:trHeight w:val="24"/>
         </w:trPr>
@@ -4689,12 +4603,6 @@
         </w:tc>
       </w:tr>
       <w:tr>
-        <w:tblPrEx>
-          <w:tblCellMar>
-            <w:top w:w="0" w:type="dxa"/>
-            <w:bottom w:w="0" w:type="dxa"/>
-          </w:tblCellMar>
-        </w:tblPrEx>
         <w:tc>
           <w:tcPr>
             <w:tcW w:w="0" w:type="auto"/>
@@ -4873,12 +4781,6 @@
         </w:tc>
       </w:tr>
       <w:tr>
-        <w:tblPrEx>
-          <w:tblCellMar>
-            <w:top w:w="0" w:type="dxa"/>
-            <w:bottom w:w="0" w:type="dxa"/>
-          </w:tblCellMar>
-        </w:tblPrEx>
         <w:tc>
           <w:tcPr>
             <w:tcW w:w="0" w:type="auto"/>
@@ -5057,12 +4959,6 @@
         </w:tc>
       </w:tr>
       <w:tr>
-        <w:tblPrEx>
-          <w:tblCellMar>
-            <w:top w:w="0" w:type="dxa"/>
-            <w:bottom w:w="0" w:type="dxa"/>
-          </w:tblCellMar>
-        </w:tblPrEx>
         <w:tc>
           <w:tcPr>
             <w:tcW w:w="0" w:type="auto"/>
@@ -5241,12 +5137,6 @@
         </w:tc>
       </w:tr>
       <w:tr>
-        <w:tblPrEx>
-          <w:tblCellMar>
-            <w:top w:w="0" w:type="dxa"/>
-            <w:bottom w:w="0" w:type="dxa"/>
-          </w:tblCellMar>
-        </w:tblPrEx>
         <w:tc>
           <w:tcPr>
             <w:tcW w:w="0" w:type="auto"/>
@@ -5873,12 +5763,6 @@
         <w:gridCol w:w="3136"/>
       </w:tblGrid>
       <w:tr>
-        <w:tblPrEx>
-          <w:tblCellMar>
-            <w:top w:w="0" w:type="dxa"/>
-            <w:bottom w:w="0" w:type="dxa"/>
-          </w:tblCellMar>
-        </w:tblPrEx>
         <w:tc>
           <w:tcPr>
             <w:tcW w:w="0" w:type="auto"/>
@@ -5989,12 +5873,6 @@
         </w:tc>
       </w:tr>
       <w:tr>
-        <w:tblPrEx>
-          <w:tblCellMar>
-            <w:top w:w="0" w:type="dxa"/>
-            <w:bottom w:w="0" w:type="dxa"/>
-          </w:tblCellMar>
-        </w:tblPrEx>
         <w:tc>
           <w:tcPr>
             <w:tcW w:w="0" w:type="auto"/>
@@ -6120,12 +5998,6 @@
         </w:tc>
       </w:tr>
       <w:tr>
-        <w:tblPrEx>
-          <w:tblCellMar>
-            <w:top w:w="0" w:type="dxa"/>
-            <w:bottom w:w="0" w:type="dxa"/>
-          </w:tblCellMar>
-        </w:tblPrEx>
         <w:tc>
           <w:tcPr>
             <w:tcW w:w="0" w:type="auto"/>
@@ -6229,12 +6101,6 @@
         </w:tc>
       </w:tr>
       <w:tr>
-        <w:tblPrEx>
-          <w:tblCellMar>
-            <w:top w:w="0" w:type="dxa"/>
-            <w:bottom w:w="0" w:type="dxa"/>
-          </w:tblCellMar>
-        </w:tblPrEx>
         <w:tc>
           <w:tcPr>
             <w:tcW w:w="0" w:type="auto"/>
@@ -6350,12 +6216,6 @@
         </w:tc>
       </w:tr>
       <w:tr>
-        <w:tblPrEx>
-          <w:tblCellMar>
-            <w:top w:w="0" w:type="dxa"/>
-            <w:bottom w:w="0" w:type="dxa"/>
-          </w:tblCellMar>
-        </w:tblPrEx>
         <w:tc>
           <w:tcPr>
             <w:tcW w:w="0" w:type="auto"/>
@@ -6497,12 +6357,6 @@
         </w:tc>
       </w:tr>
       <w:tr>
-        <w:tblPrEx>
-          <w:tblCellMar>
-            <w:top w:w="0" w:type="dxa"/>
-            <w:bottom w:w="0" w:type="dxa"/>
-          </w:tblCellMar>
-        </w:tblPrEx>
         <w:tc>
           <w:tcPr>
             <w:tcW w:w="0" w:type="auto"/>
@@ -6606,12 +6460,6 @@
         </w:tc>
       </w:tr>
       <w:tr>
-        <w:tblPrEx>
-          <w:tblCellMar>
-            <w:top w:w="0" w:type="dxa"/>
-            <w:bottom w:w="0" w:type="dxa"/>
-          </w:tblCellMar>
-        </w:tblPrEx>
         <w:tc>
           <w:tcPr>
             <w:tcW w:w="0" w:type="auto"/>
@@ -6884,18 +6732,7 @@
           <w:sz w:val="24"/>
           <w:szCs w:val="24"/>
         </w:rPr>
-        <w:t xml:space="preserve"> le modèle utilisait la qualité d'une nuit déjà passée pour deviner sa durée. En conditions réelles, cette information est inconnue au moment de la prédiction. Nous avons donc supprimé cette variable pour garantir un modèle honnête et véritabl</w:t>
-      </w:r>
-      <w:bookmarkStart w:id="0" w:name="_GoBack"/>
-      <w:bookmarkEnd w:id="0"/>
-      <w:r>
-        <w:rPr>
-          <w:rFonts w:ascii="Arial" w:eastAsia="Times New Roman" w:hAnsi="Arial" w:cs="Arial"/>
-          <w:color w:val="auto"/>
-          <w:sz w:val="24"/>
-          <w:szCs w:val="24"/>
-        </w:rPr>
-        <w:t>ement prédictif.</w:t>
+        <w:t xml:space="preserve"> le modèle utilisait la qualité d'une nuit déjà passée pour deviner sa durée. En conditions réelles, cette information est inconnue au moment de la prédiction. Nous avons donc supprimé cette variable pour garantir un modèle honnête et véritablement prédictif.</w:t>
       </w:r>
     </w:p>
     <w:p>
@@ -7675,7 +7512,7 @@
         <w:sz w:val="17"/>
         <w:szCs w:val="17"/>
       </w:rPr>
-      <w:t>8</w:t>
+      <w:t>2</w:t>
     </w:r>
     <w:r>
       <w:rPr>
@@ -8602,6 +8439,7 @@
   <w:style w:type="character" w:default="1" w:styleId="Policepardfaut">
     <w:name w:val="Default Paragraph Font"/>
     <w:uiPriority w:val="1"/>
+    <w:semiHidden/>
     <w:unhideWhenUsed/>
   </w:style>
   <w:style w:type="table" w:default="1" w:styleId="TableauNormal">
@@ -9008,6 +8846,7 @@
   <w:style w:type="character" w:default="1" w:styleId="Policepardfaut">
     <w:name w:val="Default Paragraph Font"/>
     <w:uiPriority w:val="1"/>
+    <w:semiHidden/>
     <w:unhideWhenUsed/>
   </w:style>
   <w:style w:type="table" w:default="1" w:styleId="TableauNormal">

</xml_diff>